<commit_message>
chore: rename SenseGrid to AQRESS Pulse
</commit_message>
<xml_diff>
--- a/Doc/01_IoT_System_Design_Architecture.docx
+++ b/Doc/01_IoT_System_Design_Architecture.docx
@@ -4,7 +4,7 @@
   <w:body>
     <w:p>
       <w:r>
-        <w:t>AQRESS SENSEGRID</w:t>
+        <w:t>AQRESS PULSE</w:t>
       </w:r>
     </w:p>
     <w:p>
@@ -17,7 +17,7 @@
     </w:p>
     <w:p>
       <w:r>
-        <w:t>AQRESS SenseGrid — IoT Sensor &amp; Device Management Platform</w:t>
+        <w:t>AQRESS Pulse — IoT Sensor &amp; Device Management Platform</w:t>
       </w:r>
     </w:p>
     <w:tbl>
@@ -1247,7 +1247,7 @@
               <w:rPr>
                 <w:sz w:val="18"/>
               </w:rPr>
-              <w:t>sensegrid/{device_uid}/telemetry</w:t>
+              <w:t>pulse/{device_uid}/telemetry</w:t>
             </w:r>
           </w:p>
         </w:tc>
@@ -1310,7 +1310,7 @@
               <w:rPr>
                 <w:sz w:val="18"/>
               </w:rPr>
-              <w:t>sensegrid/{device_uid}/status</w:t>
+              <w:t>pulse/{device_uid}/status</w:t>
             </w:r>
           </w:p>
         </w:tc>
@@ -1374,7 +1374,7 @@
               <w:rPr>
                 <w:sz w:val="18"/>
               </w:rPr>
-              <w:t>sensegrid/{device_uid}/config</w:t>
+              <w:t>pulse/{device_uid}/config</w:t>
             </w:r>
           </w:p>
         </w:tc>
@@ -1437,7 +1437,7 @@
               <w:rPr>
                 <w:sz w:val="18"/>
               </w:rPr>
-              <w:t>sensegrid/{device_uid}/config/ack</w:t>
+              <w:t>pulse/{device_uid}/config/ack</w:t>
             </w:r>
           </w:p>
         </w:tc>
@@ -1501,7 +1501,7 @@
               <w:rPr>
                 <w:sz w:val="18"/>
               </w:rPr>
-              <w:t>sensegrid/{device_uid}/command</w:t>
+              <w:t>pulse/{device_uid}/command</w:t>
             </w:r>
           </w:p>
         </w:tc>
@@ -1564,7 +1564,7 @@
               <w:rPr>
                 <w:sz w:val="18"/>
               </w:rPr>
-              <w:t>sensegrid/{device_uid}/command/ack</w:t>
+              <w:t>pulse/{device_uid}/command/ack</w:t>
             </w:r>
           </w:p>
         </w:tc>
@@ -2838,7 +2838,7 @@
         <w:pStyle w:val="ListBullet"/>
       </w:pPr>
       <w:r>
-        <w:t>MQTT authorization: each device is restricted to its own sensegrid/{device_uid}/ topic namespace.</w:t>
+        <w:t>MQTT authorization: each device is restricted to its own pulse/{device_uid}/ topic namespace.</w:t>
       </w:r>
     </w:p>
     <w:p>
@@ -2925,7 +2925,7 @@
       </w:pBdr>
     </w:pPr>
     <w:r>
-      <w:t>AQRESS SenseGrid — System Architecture</w:t>
+      <w:t>AQRESS Pulse — System Architecture</w:t>
     </w:r>
   </w:p>
 </w:hdr>

</xml_diff>